<commit_message>
Auto-swap remaining 11 PNG references to SVG across Chapters 2, 6, 9, 10, 12 and update Word docs
</commit_message>
<xml_diff>
--- a/chapters/word_output/CH-002_Biomecanica_Aneis.docx
+++ b/chapters/word_output/CH-002_Biomecanica_Aneis.docx
@@ -20356,7 +20356,7 @@
       <w:r>
         <w:drawing>
           <wp:inline distT="0" distB="0" distL="0" distR="0">
-            <wp:extent cx="3600450" cy="3600450"/>
+            <wp:extent cx="5038725" cy="3600450"/>
             <wp:effectExtent t="0" r="0" b="0" l="0"/>
             <wp:docPr id="1" name="" descr="" title=""/>
             <wp:cNvGraphicFramePr>
@@ -20381,7 +20381,7 @@
                   <pic:spPr bwMode="auto">
                     <a:xfrm>
                       <a:off x="0" y="0"/>
-                      <a:ext cx="3600450" cy="3600450"/>
+                      <a:ext cx="5038725" cy="3600450"/>
                     </a:xfrm>
                     <a:prstGeom prst="rect">
                       <a:avLst/>

</xml_diff>

<commit_message>
Update chapter 1 imagery with superior explanatory SVGs and fix word generation
</commit_message>
<xml_diff>
--- a/chapters/word_output/CH-002_Biomecanica_Aneis.docx
+++ b/chapters/word_output/CH-002_Biomecanica_Aneis.docx
@@ -1068,7 +1068,7 @@
           <w:insideH w:val="single" w:color="auto" w:sz="4"/>
           <w:insideV w:val="single" w:color="auto" w:sz="4"/>
         </w:tblBorders>
-        <w:tblLayout w:type="fixed"/>
+        <w:tblLayout w:type="autofit"/>
       </w:tblPr>
       <w:tblGrid>
         <w:gridCol w:w="100"/>
@@ -3175,7 +3175,7 @@
           <w:insideH w:val="single" w:color="auto" w:sz="4"/>
           <w:insideV w:val="single" w:color="auto" w:sz="4"/>
         </w:tblBorders>
-        <w:tblLayout w:type="fixed"/>
+        <w:tblLayout w:type="autofit"/>
       </w:tblPr>
       <w:tblGrid>
         <w:gridCol w:w="100"/>
@@ -4001,7 +4001,7 @@
           <w:insideH w:val="single" w:color="auto" w:sz="4"/>
           <w:insideV w:val="single" w:color="auto" w:sz="4"/>
         </w:tblBorders>
-        <w:tblLayout w:type="fixed"/>
+        <w:tblLayout w:type="autofit"/>
       </w:tblPr>
       <w:tblGrid>
         <w:gridCol w:w="100"/>
@@ -5539,7 +5539,7 @@
           <w:insideH w:val="single" w:color="auto" w:sz="4"/>
           <w:insideV w:val="single" w:color="auto" w:sz="4"/>
         </w:tblBorders>
-        <w:tblLayout w:type="fixed"/>
+        <w:tblLayout w:type="autofit"/>
       </w:tblPr>
       <w:tblGrid>
         <w:gridCol w:w="100"/>
@@ -6160,7 +6160,7 @@
           <w:insideH w:val="single" w:color="auto" w:sz="4"/>
           <w:insideV w:val="single" w:color="auto" w:sz="4"/>
         </w:tblBorders>
-        <w:tblLayout w:type="fixed"/>
+        <w:tblLayout w:type="autofit"/>
       </w:tblPr>
       <w:tblGrid>
         <w:gridCol w:w="100"/>
@@ -7469,7 +7469,7 @@
           <w:insideH w:val="single" w:color="auto" w:sz="4"/>
           <w:insideV w:val="single" w:color="auto" w:sz="4"/>
         </w:tblBorders>
-        <w:tblLayout w:type="fixed"/>
+        <w:tblLayout w:type="autofit"/>
       </w:tblPr>
       <w:tblGrid>
         <w:gridCol w:w="100"/>
@@ -7977,7 +7977,7 @@
           <w:insideH w:val="single" w:color="auto" w:sz="4"/>
           <w:insideV w:val="single" w:color="auto" w:sz="4"/>
         </w:tblBorders>
-        <w:tblLayout w:type="fixed"/>
+        <w:tblLayout w:type="autofit"/>
       </w:tblPr>
       <w:tblGrid>
         <w:gridCol w:w="100"/>
@@ -8492,7 +8492,7 @@
           <w:insideH w:val="single" w:color="auto" w:sz="4"/>
           <w:insideV w:val="single" w:color="auto" w:sz="4"/>
         </w:tblBorders>
-        <w:tblLayout w:type="fixed"/>
+        <w:tblLayout w:type="autofit"/>
       </w:tblPr>
       <w:tblGrid>
         <w:gridCol w:w="100"/>
@@ -9390,7 +9390,7 @@
           <w:insideH w:val="single" w:color="auto" w:sz="4"/>
           <w:insideV w:val="single" w:color="auto" w:sz="4"/>
         </w:tblBorders>
-        <w:tblLayout w:type="fixed"/>
+        <w:tblLayout w:type="autofit"/>
       </w:tblPr>
       <w:tblGrid>
         <w:gridCol w:w="100"/>
@@ -9876,7 +9876,7 @@
           <w:insideH w:val="single" w:color="auto" w:sz="4"/>
           <w:insideV w:val="single" w:color="auto" w:sz="4"/>
         </w:tblBorders>
-        <w:tblLayout w:type="fixed"/>
+        <w:tblLayout w:type="autofit"/>
       </w:tblPr>
       <w:tblGrid>
         <w:gridCol w:w="100"/>
@@ -10373,7 +10373,7 @@
           <w:insideH w:val="single" w:color="auto" w:sz="4"/>
           <w:insideV w:val="single" w:color="auto" w:sz="4"/>
         </w:tblBorders>
-        <w:tblLayout w:type="fixed"/>
+        <w:tblLayout w:type="autofit"/>
       </w:tblPr>
       <w:tblGrid>
         <w:gridCol w:w="100"/>
@@ -11799,7 +11799,7 @@
       <w:r>
         <w:drawing>
           <wp:inline distT="0" distB="0" distL="0" distR="0">
-            <wp:extent cx="3600450" cy="3600450"/>
+            <wp:extent cx="5038725" cy="3600450"/>
             <wp:effectExtent t="0" r="0" b="0" l="0"/>
             <wp:docPr id="1" name="" descr="" title=""/>
             <wp:cNvGraphicFramePr>
@@ -11824,7 +11824,7 @@
                   <pic:spPr bwMode="auto">
                     <a:xfrm>
                       <a:off x="0" y="0"/>
-                      <a:ext cx="3600450" cy="3600450"/>
+                      <a:ext cx="5038725" cy="3600450"/>
                     </a:xfrm>
                     <a:prstGeom prst="rect">
                       <a:avLst/>
@@ -12061,7 +12061,7 @@
           <w:insideH w:val="single" w:color="auto" w:sz="4"/>
           <w:insideV w:val="single" w:color="auto" w:sz="4"/>
         </w:tblBorders>
-        <w:tblLayout w:type="fixed"/>
+        <w:tblLayout w:type="autofit"/>
       </w:tblPr>
       <w:tblGrid>
         <w:gridCol w:w="100"/>
@@ -12515,7 +12515,7 @@
           <w:insideH w:val="single" w:color="auto" w:sz="4"/>
           <w:insideV w:val="single" w:color="auto" w:sz="4"/>
         </w:tblBorders>
-        <w:tblLayout w:type="fixed"/>
+        <w:tblLayout w:type="autofit"/>
       </w:tblPr>
       <w:tblGrid>
         <w:gridCol w:w="100"/>
@@ -14163,7 +14163,7 @@
           <w:insideH w:val="single" w:color="auto" w:sz="4"/>
           <w:insideV w:val="single" w:color="auto" w:sz="4"/>
         </w:tblBorders>
-        <w:tblLayout w:type="fixed"/>
+        <w:tblLayout w:type="autofit"/>
       </w:tblPr>
       <w:tblGrid>
         <w:gridCol w:w="100"/>
@@ -15062,7 +15062,7 @@
           <w:insideH w:val="single" w:color="auto" w:sz="4"/>
           <w:insideV w:val="single" w:color="auto" w:sz="4"/>
         </w:tblBorders>
-        <w:tblLayout w:type="fixed"/>
+        <w:tblLayout w:type="autofit"/>
       </w:tblPr>
       <w:tblGrid>
         <w:gridCol w:w="100"/>
@@ -15812,7 +15812,7 @@
           <w:insideH w:val="single" w:color="auto" w:sz="4"/>
           <w:insideV w:val="single" w:color="auto" w:sz="4"/>
         </w:tblBorders>
-        <w:tblLayout w:type="fixed"/>
+        <w:tblLayout w:type="autofit"/>
       </w:tblPr>
       <w:tblGrid>
         <w:gridCol w:w="100"/>
@@ -17970,7 +17970,7 @@
           <w:insideH w:val="single" w:color="auto" w:sz="4"/>
           <w:insideV w:val="single" w:color="auto" w:sz="4"/>
         </w:tblBorders>
-        <w:tblLayout w:type="fixed"/>
+        <w:tblLayout w:type="autofit"/>
       </w:tblPr>
       <w:tblGrid>
         <w:gridCol w:w="100"/>
@@ -18370,7 +18370,7 @@
           <w:insideH w:val="single" w:color="auto" w:sz="4"/>
           <w:insideV w:val="single" w:color="auto" w:sz="4"/>
         </w:tblBorders>
-        <w:tblLayout w:type="fixed"/>
+        <w:tblLayout w:type="autofit"/>
       </w:tblPr>
       <w:tblGrid>
         <w:gridCol w:w="100"/>

</xml_diff>